<commit_message>
Fix Manuali dopo segnalazioni di Ciani
</commit_message>
<xml_diff>
--- a/Progettazione/Manuali/Manuale tecnico.docx
+++ b/Progettazione/Manuali/Manuale tecnico.docx
@@ -213,6 +213,9 @@
                                   </w:sdtPr>
                                   <w:sdtContent>
                                     <w:r>
+                                      <w:t xml:space="preserve"> </w:t>
+                                    </w:r>
+                                    <w:r>
                                       <w:t>Varese</w:t>
                                     </w:r>
                                   </w:sdtContent>
@@ -240,7 +243,11 @@
               </mc:Choice>
               <mc:Fallback>
                 <w:pict>
-                  <v:shape w14:anchorId="519EE8C7" id="Casella di testo 128" o:spid="_x0000_s1027" type="#_x0000_t202" style="position:absolute;left:0;text-align:left;margin-left:0;margin-top:700.75pt;width:354.6pt;height:16.2pt;z-index:251662336;visibility:visible;mso-wrap-style:square;mso-width-percent:0;mso-height-percent:0;mso-wrap-distance-left:9pt;mso-wrap-distance-top:0;mso-wrap-distance-right:9pt;mso-wrap-distance-bottom:0;mso-position-horizontal:left;mso-position-horizontal-relative:margin;mso-position-vertical:absolute;mso-position-vertical-relative:margin;mso-width-percent:0;mso-height-percent:0;mso-width-relative:margin;mso-height-relative:margin;v-text-anchor:bottom" o:gfxdata="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" filled="f" strokecolor="#ffc000 [3207]" strokeweight=".5pt">
+                  <v:shapetype w14:anchorId="68E8B139" id="_x0000_t202" coordsize="21600,21600" o:spt="202" path="m,l,21600r21600,l21600,xe">
+                    <v:stroke joinstyle="miter"/>
+                    <v:path gradientshapeok="t" o:connecttype="rect"/>
+                  </v:shapetype>
+                  <v:shape id="Casella di testo 128" o:spid="_x0000_s1027" type="#_x0000_t202" style="position:absolute;left:0;text-align:left;margin-left:0;margin-top:700.75pt;width:354.6pt;height:16.2pt;z-index:251662336;visibility:visible;mso-wrap-style:square;mso-width-percent:0;mso-height-percent:0;mso-wrap-distance-left:9pt;mso-wrap-distance-top:0;mso-wrap-distance-right:9pt;mso-wrap-distance-bottom:0;mso-position-horizontal:left;mso-position-horizontal-relative:margin;mso-position-vertical:absolute;mso-position-vertical-relative:margin;mso-width-percent:0;mso-height-percent:0;mso-width-relative:margin;mso-height-relative:margin;v-text-anchor:bottom" o:gfxdata="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" filled="f" strokecolor="#fab12f" strokeweight=".5pt">
                     <v:textbox inset="1in,0,86.4pt,0">
                       <w:txbxContent>
                         <w:p>
@@ -298,6 +305,9 @@
                               <w:text/>
                             </w:sdtPr>
                             <w:sdtContent>
+                              <w:r>
+                                <w:t xml:space="preserve"> </w:t>
+                              </w:r>
                               <w:r>
                                 <w:t>Varese</w:t>
                               </w:r>
@@ -3855,7 +3865,7 @@
           <w:sz w:val="28"/>
           <w:szCs w:val="28"/>
         </w:rPr>
-        <w:t>implementato e testato nei sistemi operativi Windows 10/11 e MacOS.</w:t>
+        <w:t>implementato e testato nei sistemi operativi Windows 10/11 e macOS.</w:t>
       </w:r>
     </w:p>
     <w:p>
@@ -28989,7 +28999,6 @@
         </w:rPr>
       </w:pPr>
       <w:r>
-        <w:lastRenderedPageBreak/>
         <w:t>Gestione delle eccezioni</w:t>
       </w:r>
     </w:p>
@@ -29262,7 +29271,6 @@
       <w:bookmarkStart w:id="34" w:name="_Toc238810287"/>
       <w:bookmarkStart w:id="35" w:name="_Toc238912628"/>
       <w:r>
-        <w:lastRenderedPageBreak/>
         <w:t>6.2 Gestione degli errori</w:t>
       </w:r>
       <w:bookmarkEnd w:id="34"/>
@@ -29869,7 +29877,6 @@
         </w:rPr>
       </w:pPr>
       <w:r>
-        <w:lastRenderedPageBreak/>
         <w:t>ValidationException</w:t>
       </w:r>
     </w:p>
@@ -30594,16 +30601,7 @@
           <w:sz w:val="28"/>
           <w:szCs w:val="28"/>
         </w:rPr>
-        <w:t xml:space="preserve">, che viene successivamente </w:t>
-      </w:r>
-      <w:r>
-        <w:rPr>
-          <w:color w:val="2C2C2C"/>
-          <w:sz w:val="28"/>
-          <w:szCs w:val="28"/>
-        </w:rPr>
-        <w:lastRenderedPageBreak/>
-        <w:t xml:space="preserve">propagata al livello applicativo. In questo modo i livelli superiori non devono dipendere direttamente dalle eccezioni specifiche di JDBC. </w:t>
+        <w:t xml:space="preserve">, che viene successivamente propagata al livello applicativo. In questo modo i livelli superiori non devono dipendere direttamente dalle eccezioni specifiche di JDBC. </w:t>
       </w:r>
     </w:p>
     <w:p>
@@ -31136,7 +31134,6 @@
           <w:sz w:val="28"/>
           <w:szCs w:val="28"/>
         </w:rPr>
-        <w:lastRenderedPageBreak/>
         <w:t>IOException</w:t>
       </w:r>
       <w:r>
@@ -31380,7 +31377,6 @@
       <w:bookmarkStart w:id="36" w:name="_Toc238810288"/>
       <w:bookmarkStart w:id="37" w:name="_Toc238912629"/>
       <w:r>
-        <w:lastRenderedPageBreak/>
         <w:t>6.3 Gestione della sicurezza</w:t>
       </w:r>
       <w:bookmarkEnd w:id="36"/>
@@ -32065,16 +32061,7 @@
           <w:sz w:val="28"/>
           <w:szCs w:val="28"/>
         </w:rPr>
-        <w:t xml:space="preserve">. In caso di credenziali non valide viene </w:t>
-      </w:r>
-      <w:r>
-        <w:rPr>
-          <w:color w:val="2C2C2C"/>
-          <w:sz w:val="28"/>
-          <w:szCs w:val="28"/>
-        </w:rPr>
-        <w:lastRenderedPageBreak/>
-        <w:t xml:space="preserve">utilizzato un messaggio unico per username inesistente e password errata, evitando di rivelare se uno specifico username è presente nel sistema. </w:t>
+        <w:t xml:space="preserve">. In caso di credenziali non valide viene utilizzato un messaggio unico per username inesistente e password errata, evitando di rivelare se uno specifico username è presente nel sistema. </w:t>
       </w:r>
     </w:p>
     <w:p>
@@ -32571,7 +32558,6 @@
           <w:sz w:val="28"/>
           <w:szCs w:val="28"/>
         </w:rPr>
-        <w:lastRenderedPageBreak/>
         <w:t>Questa separazione permette di mantenere nei DAO esclusivamente le responsabilità relative alla persistenza, evitando di affidare al livello di accesso ai dati i controlli relativi alle autorizzazioni.</w:t>
       </w:r>
     </w:p>
@@ -33130,7 +33116,6 @@
         </w:rPr>
       </w:pPr>
       <w:r>
-        <w:lastRenderedPageBreak/>
         <w:t>Recupero dell</w:t>
       </w:r>
       <w:r>
@@ -33447,7 +33432,6 @@
       <w:bookmarkStart w:id="38" w:name="_Toc238810289"/>
       <w:bookmarkStart w:id="39" w:name="_Toc238912630"/>
       <w:r>
-        <w:lastRenderedPageBreak/>
         <w:t>6.4 Gestione dei servizi di geolocalizzazione</w:t>
       </w:r>
       <w:bookmarkEnd w:id="38"/>
@@ -34311,7 +34295,6 @@
           <w:sz w:val="28"/>
           <w:szCs w:val="28"/>
         </w:rPr>
-        <w:lastRenderedPageBreak/>
         <w:t>CAMPO_LAT</w:t>
       </w:r>
       <w:r>
@@ -34966,7 +34949,6 @@
         </w:rPr>
       </w:pPr>
       <w:r>
-        <w:lastRenderedPageBreak/>
         <w:t>Gestione degli errori</w:t>
       </w:r>
       <w:r>
@@ -35452,16 +35434,7 @@
           <w:sz w:val="28"/>
           <w:szCs w:val="28"/>
         </w:rPr>
-        <w:t xml:space="preserve">: se il servizio esterno non è raggiungibile, non </w:t>
-      </w:r>
-      <w:r>
-        <w:rPr>
-          <w:color w:val="2C2C2C"/>
-          <w:sz w:val="28"/>
-          <w:szCs w:val="28"/>
-        </w:rPr>
-        <w:lastRenderedPageBreak/>
-        <w:t>riconosce l</w:t>
+        <w:t>: se il servizio esterno non è raggiungibile, non riconosce l</w:t>
       </w:r>
       <w:r>
         <w:rPr>
@@ -36282,7 +36255,6 @@
           <w:sz w:val="28"/>
           <w:szCs w:val="28"/>
         </w:rPr>
-        <w:lastRenderedPageBreak/>
         <w:t>estrai(Pattern campo, String corpo)</w:t>
       </w:r>
       <w:r>
@@ -36843,7 +36815,6 @@
           <w:sz w:val="28"/>
           <w:szCs w:val="28"/>
         </w:rPr>
-        <w:lastRenderedPageBreak/>
         <w:t>Thread.currentThread().interrupt()</w:t>
       </w:r>
       <w:r>
@@ -37045,7 +37016,6 @@
       <w:bookmarkStart w:id="40" w:name="_Toc238810290"/>
       <w:bookmarkStart w:id="41" w:name="_Toc238912631"/>
       <w:r>
-        <w:lastRenderedPageBreak/>
         <w:t>6.5 Patterns significativi</w:t>
       </w:r>
       <w:bookmarkEnd w:id="40"/>
@@ -38091,7 +38061,6 @@
           <w:sz w:val="20"/>
           <w:szCs w:val="28"/>
         </w:rPr>
-        <w:lastRenderedPageBreak/>
         <w:t xml:space="preserve">ELIMINA_RISTORANTE, VEDI_RISTORANTI_GESTITI, LEGGI_RECENSIONI_RISTORANTI_GESTITI, </w:t>
       </w:r>
     </w:p>
@@ -39101,7 +39070,6 @@
           <w:szCs w:val="28"/>
           <w:lang w:val="en-GB"/>
         </w:rPr>
-        <w:lastRenderedPageBreak/>
         <w:t xml:space="preserve">    }</w:t>
       </w:r>
     </w:p>
@@ -40087,7 +40055,6 @@
           <w:sz w:val="28"/>
           <w:szCs w:val="28"/>
         </w:rPr>
-        <w:lastRenderedPageBreak/>
         <w:t>ServerConnection</w:t>
       </w:r>
       <w:r>
@@ -40889,7 +40856,6 @@
       <w:bookmarkStart w:id="42" w:name="_Toc238810291"/>
       <w:bookmarkStart w:id="43" w:name="_Toc238912632"/>
       <w:r>
-        <w:lastRenderedPageBreak/>
         <w:t>6.6 Ottimizzazioni delle prestazioni</w:t>
       </w:r>
       <w:bookmarkEnd w:id="42"/>
@@ -41483,7 +41449,6 @@
           <w:sz w:val="28"/>
           <w:szCs w:val="28"/>
         </w:rPr>
-        <w:lastRenderedPageBreak/>
         <w:t>I vantaggi che ne derivano sono:</w:t>
       </w:r>
     </w:p>
@@ -42305,7 +42270,6 @@
       <w:bookmarkStart w:id="44" w:name="_Toc238810292"/>
       <w:bookmarkStart w:id="45" w:name="_Toc238912633"/>
       <w:r>
-        <w:lastRenderedPageBreak/>
         <w:t>7. Installazione ed esecuzione</w:t>
       </w:r>
       <w:bookmarkEnd w:id="44"/>
@@ -42569,10 +42533,6 @@
     </w:p>
     <w:p>
       <w:pPr>
-        <w:numPr>
-          <w:ilvl w:val="0"/>
-          <w:numId w:val="21"/>
-        </w:numPr>
         <w:jc w:val="both"/>
         <w:rPr>
           <w:sz w:val="28"/>
@@ -42761,7 +42721,6 @@
           <w:sz w:val="28"/>
           <w:szCs w:val="28"/>
         </w:rPr>
-        <w:lastRenderedPageBreak/>
         <w:t>Gli</w:t>
       </w:r>
       <w:r>
@@ -43211,7 +43170,7 @@
           <w:sz w:val="28"/>
           <w:szCs w:val="28"/>
         </w:rPr>
-        <w:t>.</w:t>
+        <w:t xml:space="preserve"> (rispettivamente localhost, tk_app e TheKnife-B per l’utente applicativo creato dal profilo Maven db-setup).</w:t>
       </w:r>
     </w:p>
     <w:p>
@@ -43345,7 +43304,6 @@
           <w:sz w:val="28"/>
           <w:szCs w:val="28"/>
         </w:rPr>
-        <w:lastRenderedPageBreak/>
         <w:t xml:space="preserve">Il client utilizza quindi </w:t>
       </w:r>
       <w:r>
@@ -43525,7 +43483,6 @@
       <w:bookmarkStart w:id="47" w:name="cap_dataset_prova"/>
       <w:bookmarkStart w:id="48" w:name="_Toc238912634"/>
       <w:r>
-        <w:lastRenderedPageBreak/>
         <w:t xml:space="preserve">8. Dataset di </w:t>
       </w:r>
       <w:r>
@@ -43939,7 +43896,6 @@
         <w:rPr>
           <w:sz w:val="28"/>
         </w:rPr>
-        <w:lastRenderedPageBreak/>
         <w:t>In alternativa, gli stessi tre script sono eseguibili a mano con psql, nello stesso ordine, sul database dbTK.</w:t>
       </w:r>
     </w:p>
@@ -45117,7 +45073,6 @@
                 <w:sz w:val="28"/>
                 <w:szCs w:val="28"/>
               </w:rPr>
-              <w:lastRenderedPageBreak/>
               <w:t>Inserimento</w:t>
             </w:r>
           </w:p>
@@ -45934,7 +45889,6 @@
         </w:rPr>
       </w:pPr>
       <w:r>
-        <w:lastRenderedPageBreak/>
         <w:t xml:space="preserve">Relazioni e dati creati durante </w:t>
       </w:r>
       <w:r>
@@ -46060,7 +46014,6 @@
       <w:bookmarkStart w:id="49" w:name="_Toc238810294"/>
       <w:bookmarkStart w:id="50" w:name="_Toc238912635"/>
       <w:r>
-        <w:lastRenderedPageBreak/>
         <w:t>9. Considerazioni progettual</w:t>
       </w:r>
       <w:r>
@@ -46545,7 +46498,6 @@
         </w:rPr>
       </w:pPr>
       <w:r>
-        <w:lastRenderedPageBreak/>
         <w:t>Considerazioni sull</w:t>
       </w:r>
       <w:r>
@@ -46686,7 +46638,6 @@
       <w:bookmarkStart w:id="51" w:name="_Toc238810295"/>
       <w:bookmarkStart w:id="52" w:name="_Toc238912636"/>
       <w:r>
-        <w:lastRenderedPageBreak/>
         <w:t>10. Limiti della soluzione sviluppata</w:t>
       </w:r>
       <w:bookmarkEnd w:id="51"/>
@@ -47030,16 +46981,7 @@
           <w:sz w:val="28"/>
           <w:szCs w:val="28"/>
         </w:rPr>
-        <w:t xml:space="preserve">Le sessioni utente sono mantenute esclusivamente in memoria dal server. Di conseguenza, il riavvio del server comporta la perdita delle sessioni attive e richiede una nuova autenticazione da parte degli utenti. Inoltre, in presenza di più istanze del </w:t>
-      </w:r>
-      <w:r>
-        <w:rPr>
-          <w:color w:val="2C2C2C"/>
-          <w:sz w:val="28"/>
-          <w:szCs w:val="28"/>
-        </w:rPr>
-        <w:lastRenderedPageBreak/>
-        <w:t>server, la gestione delle sessioni richiederebbe un meccanismo di condivisione dello stato o un archivio esterno.</w:t>
+        <w:t>Le sessioni utente sono mantenute esclusivamente in memoria dal server. Di conseguenza, il riavvio del server comporta la perdita delle sessioni attive e richiede una nuova autenticazione da parte degli utenti. Inoltre, in presenza di più istanze del server, la gestione delle sessioni richiederebbe un meccanismo di condivisione dello stato o un archivio esterno.</w:t>
       </w:r>
     </w:p>
     <w:p>
@@ -47456,7 +47398,6 @@
         </w:rPr>
       </w:pPr>
       <w:r>
-        <w:lastRenderedPageBreak/>
         <w:t>Limiti nel collaudo del sistema</w:t>
       </w:r>
     </w:p>
@@ -48076,7 +48017,6 @@
           <w:sz w:val="28"/>
           <w:szCs w:val="28"/>
         </w:rPr>
-        <w:lastRenderedPageBreak/>
         <w:t>leaflet.css</w:t>
       </w:r>
       <w:r>
@@ -48479,7 +48419,6 @@
       <w:bookmarkStart w:id="53" w:name="_Toc238810296"/>
       <w:bookmarkStart w:id="54" w:name="_Toc238912637"/>
       <w:r>
-        <w:lastRenderedPageBreak/>
         <w:t>11. Bibliografia e s</w:t>
       </w:r>
       <w:r>
@@ -53707,7 +53646,7 @@
 <CoverPageProperties xmlns="http://schemas.microsoft.com/office/2006/coverPageProps">
   <PublishDate/>
   <Abstract/>
-  <CompanyAddress>Varese</CompanyAddress>
+  <CompanyAddress> Varese</CompanyAddress>
   <CompanyPhone/>
   <CompanyFax/>
   <CompanyEmail/>

</xml_diff>